<commit_message>
fix: rename api to v1 to fix vercel 404, add delete features
</commit_message>
<xml_diff>
--- a/public/templates/MG_template.docx
+++ b/public/templates/MG_template.docx
@@ -89,7 +89,7 @@
           </mc:Choice>
           <mc:Fallback>
             <w:pict>
-              <v:rect w14:anchorId="0781D506" id="Rectangle 2" o:spid="_x0000_s1026" style="position:absolute;margin-left:28.8pt;margin-top:289.6pt;width:540pt;height:32.4pt;z-index:-251663872;visibility:visible;mso-wrap-style:square;mso-width-percent:0;mso-height-percent:0;mso-wrap-distance-left:9pt;mso-wrap-distance-top:0;mso-wrap-distance-right:9pt;mso-wrap-distance-bottom:0;mso-position-horizontal:absolute;mso-position-horizontal-relative:page;mso-position-vertical:absolute;mso-position-vertical-relative:page;mso-width-percent:0;mso-height-percent:0;mso-width-relative:page;mso-height-relative:page;v-text-anchor:top" o:gfxdata="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" o:allowincell="f" fillcolor="silver" strokecolor="white" strokeweight="1pt">
+              <v:rect w14:anchorId="743EF79F" id="Rectangle 2" o:spid="_x0000_s1026" style="position:absolute;margin-left:28.8pt;margin-top:289.6pt;width:540pt;height:32.4pt;z-index:-251663872;visibility:visible;mso-wrap-style:square;mso-width-percent:0;mso-height-percent:0;mso-wrap-distance-left:9pt;mso-wrap-distance-top:0;mso-wrap-distance-right:9pt;mso-wrap-distance-bottom:0;mso-position-horizontal:absolute;mso-position-horizontal-relative:page;mso-position-vertical:absolute;mso-position-vertical-relative:page;mso-width-percent:0;mso-height-percent:0;mso-width-relative:page;mso-height-relative:page;v-text-anchor:top" o:gfxdata="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" o:allowincell="f" fillcolor="silver" strokecolor="white" strokeweight="1pt">
                 <w10:wrap anchorx="page" anchory="page"/>
               </v:rect>
             </w:pict>
@@ -169,7 +169,7 @@
           </mc:Choice>
           <mc:Fallback>
             <w:pict>
-              <v:rect w14:anchorId="31DFB612" id="Rectangle 3" o:spid="_x0000_s1026" style="position:absolute;margin-left:28.8pt;margin-top:289.6pt;width:540.75pt;height:313.9pt;z-index:-251662848;visibility:visible;mso-wrap-style:square;mso-width-percent:0;mso-height-percent:0;mso-wrap-distance-left:9pt;mso-wrap-distance-top:0;mso-wrap-distance-right:9pt;mso-wrap-distance-bottom:0;mso-position-horizontal:absolute;mso-position-horizontal-relative:page;mso-position-vertical:absolute;mso-position-vertical-relative:page;mso-width-percent:0;mso-height-percent:0;mso-width-relative:page;mso-height-relative:page;v-text-anchor:top" o:gfxdata="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" o:allowincell="f" filled="f" strokeweight="1pt">
+              <v:rect w14:anchorId="6A4B8D24" id="Rectangle 3" o:spid="_x0000_s1026" style="position:absolute;margin-left:28.8pt;margin-top:289.6pt;width:540.75pt;height:313.9pt;z-index:-251662848;visibility:visible;mso-wrap-style:square;mso-width-percent:0;mso-height-percent:0;mso-wrap-distance-left:9pt;mso-wrap-distance-top:0;mso-wrap-distance-right:9pt;mso-wrap-distance-bottom:0;mso-position-horizontal:absolute;mso-position-horizontal-relative:page;mso-position-vertical:absolute;mso-position-vertical-relative:page;mso-width-percent:0;mso-height-percent:0;mso-width-relative:page;mso-height-relative:page;v-text-anchor:top" o:gfxdata="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" o:allowincell="f" filled="f" strokeweight="1pt">
                 <w10:wrap anchorx="page" anchory="page"/>
               </v:rect>
             </w:pict>
@@ -245,7 +245,7 @@
           </mc:Choice>
           <mc:Fallback>
             <w:pict>
-              <v:line w14:anchorId="1DA502B2" id="Line 4" o:spid="_x0000_s1026" style="position:absolute;z-index:-251660800;visibility:visible;mso-wrap-style:square;mso-width-percent:0;mso-height-percent:0;mso-wrap-distance-left:9pt;mso-wrap-distance-top:0;mso-wrap-distance-right:9pt;mso-wrap-distance-bottom:0;mso-position-horizontal:absolute;mso-position-horizontal-relative:page;mso-position-vertical:absolute;mso-position-vertical-relative:page;mso-width-percent:0;mso-height-percent:0;mso-width-relative:page;mso-height-relative:page" from="430.8pt,289.6pt" to="430.8pt,581.95pt" o:gfxdata="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" o:allowincell="f" strokeweight="1pt">
+              <v:line w14:anchorId="5471BB35" id="Line 4" o:spid="_x0000_s1026" style="position:absolute;z-index:-251660800;visibility:visible;mso-wrap-style:square;mso-width-percent:0;mso-height-percent:0;mso-wrap-distance-left:9pt;mso-wrap-distance-top:0;mso-wrap-distance-right:9pt;mso-wrap-distance-bottom:0;mso-position-horizontal:absolute;mso-position-horizontal-relative:page;mso-position-vertical:absolute;mso-position-vertical-relative:page;mso-width-percent:0;mso-height-percent:0;mso-width-relative:page;mso-height-relative:page" from="430.8pt,289.6pt" to="430.8pt,581.95pt" o:gfxdata="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" o:allowincell="f" strokeweight="1pt">
                 <w10:wrap anchorx="page" anchory="page"/>
               </v:line>
             </w:pict>
@@ -321,7 +321,7 @@
           </mc:Choice>
           <mc:Fallback>
             <w:pict>
-              <v:line w14:anchorId="6D6CF6D9" id="Line 5" o:spid="_x0000_s1026" style="position:absolute;z-index:-251658752;visibility:visible;mso-wrap-style:square;mso-width-percent:0;mso-height-percent:0;mso-wrap-distance-left:9pt;mso-wrap-distance-top:0;mso-wrap-distance-right:9pt;mso-wrap-distance-bottom:0;mso-position-horizontal:absolute;mso-position-horizontal-relative:page;mso-position-vertical:absolute;mso-position-vertical-relative:page;mso-width-percent:0;mso-height-percent:0;mso-width-relative:page;mso-height-relative:page" from="28.8pt,319.45pt" to="568.85pt,319.45pt" o:gfxdata="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" o:allowincell="f" strokeweight="1pt">
+              <v:line w14:anchorId="2F13A320" id="Line 5" o:spid="_x0000_s1026" style="position:absolute;z-index:-251658752;visibility:visible;mso-wrap-style:square;mso-width-percent:0;mso-height-percent:0;mso-wrap-distance-left:9pt;mso-wrap-distance-top:0;mso-wrap-distance-right:9pt;mso-wrap-distance-bottom:0;mso-position-horizontal:absolute;mso-position-horizontal-relative:page;mso-position-vertical:absolute;mso-position-vertical-relative:page;mso-width-percent:0;mso-height-percent:0;mso-width-relative:page;mso-height-relative:page" from="28.8pt,319.45pt" to="568.85pt,319.45pt" o:gfxdata="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" o:allowincell="f" strokeweight="1pt">
                 <w10:wrap anchorx="page" anchory="page"/>
               </v:line>
             </w:pict>
@@ -397,7 +397,7 @@
           </mc:Choice>
           <mc:Fallback>
             <w:pict>
-              <v:line w14:anchorId="0E14363E" id="Line 6" o:spid="_x0000_s1026" style="position:absolute;z-index:-251657728;visibility:visible;mso-wrap-style:square;mso-width-percent:0;mso-height-percent:0;mso-wrap-distance-left:9pt;mso-wrap-distance-top:0;mso-wrap-distance-right:9pt;mso-wrap-distance-bottom:0;mso-position-horizontal:absolute;mso-position-horizontal-relative:page;mso-position-vertical:absolute;mso-position-vertical-relative:page;mso-width-percent:0;mso-height-percent:0;mso-width-relative:page;mso-height-relative:page" from="503.55pt,289.6pt" to="503.55pt,582.1pt" o:gfxdata="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" o:allowincell="f" strokeweight="1pt">
+              <v:line w14:anchorId="1817E16F" id="Line 6" o:spid="_x0000_s1026" style="position:absolute;z-index:-251657728;visibility:visible;mso-wrap-style:square;mso-width-percent:0;mso-height-percent:0;mso-wrap-distance-left:9pt;mso-wrap-distance-top:0;mso-wrap-distance-right:9pt;mso-wrap-distance-bottom:0;mso-position-horizontal:absolute;mso-position-horizontal-relative:page;mso-position-vertical:absolute;mso-position-vertical-relative:page;mso-width-percent:0;mso-height-percent:0;mso-width-relative:page;mso-height-relative:page" from="503.55pt,289.6pt" to="503.55pt,582.1pt" o:gfxdata="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" o:allowincell="f" strokeweight="1pt">
                 <w10:wrap anchorx="page" anchory="page"/>
               </v:line>
             </w:pict>
@@ -473,7 +473,7 @@
           </mc:Choice>
           <mc:Fallback>
             <w:pict>
-              <v:line w14:anchorId="4A8B0C34" id="Line 7" o:spid="_x0000_s1026" style="position:absolute;z-index:-251656704;visibility:visible;mso-wrap-style:square;mso-width-percent:0;mso-height-percent:0;mso-wrap-distance-left:9pt;mso-wrap-distance-top:0;mso-wrap-distance-right:9pt;mso-wrap-distance-bottom:0;mso-position-horizontal:absolute;mso-position-horizontal-relative:page;mso-position-vertical:absolute;mso-position-vertical-relative:page;mso-width-percent:0;mso-height-percent:0;mso-width-relative:page;mso-height-relative:page" from="61.05pt,289.6pt" to="61.05pt,581.95pt" o:gfxdata="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" o:allowincell="f" strokeweight="1pt">
+              <v:line w14:anchorId="285BD024" id="Line 7" o:spid="_x0000_s1026" style="position:absolute;z-index:-251656704;visibility:visible;mso-wrap-style:square;mso-width-percent:0;mso-height-percent:0;mso-wrap-distance-left:9pt;mso-wrap-distance-top:0;mso-wrap-distance-right:9pt;mso-wrap-distance-bottom:0;mso-position-horizontal:absolute;mso-position-horizontal-relative:page;mso-position-vertical:absolute;mso-position-vertical-relative:page;mso-width-percent:0;mso-height-percent:0;mso-width-relative:page;mso-height-relative:page" from="61.05pt,289.6pt" to="61.05pt,581.95pt" o:gfxdata="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" o:allowincell="f" strokeweight="1pt">
                 <w10:wrap anchorx="page" anchory="page"/>
               </v:line>
             </w:pict>
@@ -549,7 +549,7 @@
           </mc:Choice>
           <mc:Fallback>
             <w:pict>
-              <v:line w14:anchorId="5BE07E19" id="Line 8" o:spid="_x0000_s1026" style="position:absolute;z-index:-251655680;visibility:visible;mso-wrap-style:square;mso-width-percent:0;mso-height-percent:0;mso-wrap-distance-left:9pt;mso-wrap-distance-top:0;mso-wrap-distance-right:9pt;mso-wrap-distance-bottom:0;mso-position-horizontal:absolute;mso-position-horizontal-relative:page;mso-position-vertical:absolute;mso-position-vertical-relative:page;mso-width-percent:0;mso-height-percent:0;mso-width-relative:page;mso-height-relative:page" from="97.05pt,289.6pt" to="97.05pt,581.95pt" o:gfxdata="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" o:allowincell="f" strokeweight="1pt">
+              <v:line w14:anchorId="7A17DC60" id="Line 8" o:spid="_x0000_s1026" style="position:absolute;z-index:-251655680;visibility:visible;mso-wrap-style:square;mso-width-percent:0;mso-height-percent:0;mso-wrap-distance-left:9pt;mso-wrap-distance-top:0;mso-wrap-distance-right:9pt;mso-wrap-distance-bottom:0;mso-position-horizontal:absolute;mso-position-horizontal-relative:page;mso-position-vertical:absolute;mso-position-vertical-relative:page;mso-width-percent:0;mso-height-percent:0;mso-width-relative:page;mso-height-relative:page" from="97.05pt,289.6pt" to="97.05pt,581.95pt" o:gfxdata="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" o:allowincell="f" strokeweight="1pt">
                 <w10:wrap anchorx="page" anchory="page"/>
               </v:line>
             </w:pict>
@@ -625,7 +625,7 @@
           </mc:Choice>
           <mc:Fallback>
             <w:pict>
-              <v:line w14:anchorId="3B575227" id="Line 9" o:spid="_x0000_s1026" style="position:absolute;z-index:-251654656;visibility:visible;mso-wrap-style:square;mso-width-percent:0;mso-height-percent:0;mso-wrap-distance-left:9pt;mso-wrap-distance-top:0;mso-wrap-distance-right:9pt;mso-wrap-distance-bottom:0;mso-position-horizontal:absolute;mso-position-horizontal-relative:page;mso-position-vertical:absolute;mso-position-vertical-relative:page;mso-width-percent:0;mso-height-percent:0;mso-width-relative:page;mso-height-relative:page" from="184.8pt,290.45pt" to="184.8pt,582.85pt" o:gfxdata="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" o:allowincell="f" strokeweight="1pt">
+              <v:line w14:anchorId="1FE5AB42" id="Line 9" o:spid="_x0000_s1026" style="position:absolute;z-index:-251654656;visibility:visible;mso-wrap-style:square;mso-width-percent:0;mso-height-percent:0;mso-wrap-distance-left:9pt;mso-wrap-distance-top:0;mso-wrap-distance-right:9pt;mso-wrap-distance-bottom:0;mso-position-horizontal:absolute;mso-position-horizontal-relative:page;mso-position-vertical:absolute;mso-position-vertical-relative:page;mso-width-percent:0;mso-height-percent:0;mso-width-relative:page;mso-height-relative:page" from="184.8pt,290.45pt" to="184.8pt,582.85pt" o:gfxdata="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" o:allowincell="f" strokeweight="1pt">
                 <w10:wrap anchorx="page" anchory="page"/>
               </v:line>
             </w:pict>
@@ -701,7 +701,7 @@
           </mc:Choice>
           <mc:Fallback>
             <w:pict>
-              <v:line w14:anchorId="6220A88F" id="Line 10" o:spid="_x0000_s1026" style="position:absolute;z-index:-251653632;visibility:visible;mso-wrap-style:square;mso-width-percent:0;mso-height-percent:0;mso-wrap-distance-left:9pt;mso-wrap-distance-top:0;mso-wrap-distance-right:9pt;mso-wrap-distance-bottom:0;mso-position-horizontal:absolute;mso-position-horizontal-relative:page;mso-position-vertical:absolute;mso-position-vertical-relative:page;mso-width-percent:0;mso-height-percent:0;mso-width-relative:page;mso-height-relative:page" from="28.8pt,581.85pt" to="568.85pt,581.85pt" o:gfxdata="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" o:allowincell="f" strokeweight="1pt">
+              <v:line w14:anchorId="20D09AC2" id="Line 10" o:spid="_x0000_s1026" style="position:absolute;z-index:-251653632;visibility:visible;mso-wrap-style:square;mso-width-percent:0;mso-height-percent:0;mso-wrap-distance-left:9pt;mso-wrap-distance-top:0;mso-wrap-distance-right:9pt;mso-wrap-distance-bottom:0;mso-position-horizontal:absolute;mso-position-horizontal-relative:page;mso-position-vertical:absolute;mso-position-vertical-relative:page;mso-width-percent:0;mso-height-percent:0;mso-width-relative:page;mso-height-relative:page" from="28.8pt,581.85pt" to="568.85pt,581.85pt" o:gfxdata="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" o:allowincell="f" strokeweight="1pt">
                 <w10:wrap anchorx="page" anchory="page"/>
               </v:line>
             </w:pict>
@@ -769,27 +769,7 @@
           <w:sz w:val="19"/>
           <w:szCs w:val="24"/>
         </w:rPr>
-        <w:t>{</w:t>
-      </w:r>
-      <w:proofErr w:type="spellStart"/>
-      <w:r>
-        <w:rPr>
-          <w:rFonts w:ascii="Arial" w:hAnsi="Arial" w:cs="Arial"/>
-          <w:color w:val="000000"/>
-          <w:sz w:val="19"/>
-          <w:szCs w:val="24"/>
-        </w:rPr>
-        <w:t>quoteNo</w:t>
-      </w:r>
-      <w:proofErr w:type="spellEnd"/>
-      <w:r>
-        <w:rPr>
-          <w:rFonts w:ascii="Arial" w:hAnsi="Arial" w:cs="Arial"/>
-          <w:color w:val="000000"/>
-          <w:sz w:val="19"/>
-          <w:szCs w:val="24"/>
-        </w:rPr>
-        <w:t>}</w:t>
+        <w:t>{quoteNo}</w:t>
       </w:r>
     </w:p>
     <w:p>
@@ -818,19 +798,8 @@
           <w:sz w:val="17"/>
           <w:szCs w:val="24"/>
         </w:rPr>
-        <w:t xml:space="preserve">Bill </w:t>
-      </w:r>
-      <w:proofErr w:type="gramStart"/>
-      <w:r>
-        <w:rPr>
-          <w:rFonts w:ascii="Arial" w:hAnsi="Arial" w:cs="Arial"/>
-          <w:color w:val="000000"/>
-          <w:sz w:val="17"/>
-          <w:szCs w:val="24"/>
-        </w:rPr>
-        <w:t>To :</w:t>
-      </w:r>
-      <w:proofErr w:type="gramEnd"/>
+        <w:t>Bill To :</w:t>
+      </w:r>
     </w:p>
     <w:p>
       <w:pPr>
@@ -1029,31 +998,7 @@
           <w:szCs w:val="19"/>
           <w:lang w:eastAsia="zh-CN"/>
         </w:rPr>
-        <w:t>{</w:t>
-      </w:r>
-      <w:proofErr w:type="spellStart"/>
-      <w:r>
-        <w:rPr>
-          <w:rFonts w:ascii="Arial" w:hAnsi="Arial" w:cs="Arial"/>
-          <w:color w:val="000000"/>
-          <w:kern w:val="2"/>
-          <w:sz w:val="19"/>
-          <w:szCs w:val="19"/>
-          <w:lang w:eastAsia="zh-CN"/>
-        </w:rPr>
-        <w:t>shipTo</w:t>
-      </w:r>
-      <w:proofErr w:type="spellEnd"/>
-      <w:r>
-        <w:rPr>
-          <w:rFonts w:ascii="Arial" w:hAnsi="Arial" w:cs="Arial"/>
-          <w:color w:val="000000"/>
-          <w:kern w:val="2"/>
-          <w:sz w:val="19"/>
-          <w:szCs w:val="19"/>
-          <w:lang w:eastAsia="zh-CN"/>
-        </w:rPr>
-        <w:t>}</w:t>
+        <w:t>{shipTo}</w:t>
       </w:r>
     </w:p>
     <w:p>
@@ -1140,7 +1085,6 @@
           <w:szCs w:val="24"/>
         </w:rPr>
       </w:pPr>
-      <w:proofErr w:type="gramStart"/>
       <w:r>
         <w:rPr>
           <w:rFonts w:ascii="Arial" w:hAnsi="Arial" w:cs="Arial"/>
@@ -1150,7 +1094,6 @@
         </w:rPr>
         <w:t>Fax :</w:t>
       </w:r>
-      <w:proofErr w:type="gramEnd"/>
     </w:p>
     <w:p>
       <w:pPr>
@@ -1180,7 +1123,6 @@
           <w:szCs w:val="24"/>
         </w:rPr>
       </w:pPr>
-      <w:proofErr w:type="gramStart"/>
       <w:r>
         <w:rPr>
           <w:rFonts w:ascii="Arial" w:hAnsi="Arial" w:cs="Arial"/>
@@ -1190,7 +1132,6 @@
         </w:rPr>
         <w:t>Email :</w:t>
       </w:r>
-      <w:proofErr w:type="gramEnd"/>
       <w:r>
         <w:rPr>
           <w:rFonts w:ascii="Arial" w:hAnsi="Arial" w:cs="Arial"/>
@@ -1198,63 +1139,71 @@
           <w:sz w:val="17"/>
           <w:szCs w:val="24"/>
         </w:rPr>
-        <w:t xml:space="preserve">  </w:t>
-      </w:r>
-      <w:proofErr w:type="gramStart"/>
-      <w:r>
-        <w:rPr>
-          <w:rFonts w:ascii="Arial" w:hAnsi="Arial" w:cs="Arial"/>
-          <w:color w:val="000000"/>
+        <w:t xml:space="preserve">     </w:t>
+      </w:r>
+      <w:r>
+        <w:rPr>
+          <w:rFonts w:ascii="Arial" w:eastAsia="Times New Roman" w:hAnsi="Arial" w:cs="Arial"/>
+          <w:color w:val="000000"/>
+          <w:kern w:val="2"/>
           <w:sz w:val="17"/>
           <w:szCs w:val="24"/>
         </w:rPr>
-        <w:t xml:space="preserve">   </w:t>
-      </w:r>
-      <w:r>
-        <w:rPr>
-          <w:rFonts w:ascii="Arial" w:eastAsia="Times New Roman" w:hAnsi="Arial" w:cs="Arial"/>
-          <w:color w:val="000000"/>
-          <w:kern w:val="2"/>
+        <w:t>{email}</w:t>
+      </w:r>
+    </w:p>
+    <w:p>
+      <w:pPr>
+        <w:framePr w:w="4111" w:h="216" w:hRule="exact" w:wrap="auto" w:vAnchor="page" w:hAnchor="page" w:x="6320" w:y="5247"/>
+        <w:widowControl w:val="0"/>
+        <w:tabs>
+          <w:tab w:val="left" w:pos="360"/>
+          <w:tab w:val="left" w:pos="720"/>
+        </w:tabs>
+        <w:autoSpaceDE w:val="0"/>
+        <w:autoSpaceDN w:val="0"/>
+        <w:adjustRightInd w:val="0"/>
+        <w:spacing w:after="0" w:line="240" w:lineRule="auto"/>
+        <w:rPr>
+          <w:rFonts w:ascii="Arial" w:hAnsi="Arial" w:cs="Arial"/>
+          <w:color w:val="000000"/>
           <w:sz w:val="17"/>
           <w:szCs w:val="24"/>
         </w:rPr>
-        <w:t>{</w:t>
-      </w:r>
-      <w:proofErr w:type="gramEnd"/>
-      <w:r>
-        <w:rPr>
-          <w:rFonts w:ascii="Arial" w:eastAsia="Times New Roman" w:hAnsi="Arial" w:cs="Arial"/>
-          <w:color w:val="000000"/>
-          <w:kern w:val="2"/>
+      </w:pPr>
+    </w:p>
+    <w:p>
+      <w:pPr>
+        <w:framePr w:w="882" w:h="240" w:hRule="exact" w:wrap="auto" w:vAnchor="page" w:hAnchor="page" w:x="6320" w:y="4783"/>
+        <w:widowControl w:val="0"/>
+        <w:tabs>
+          <w:tab w:val="left" w:pos="360"/>
+          <w:tab w:val="left" w:pos="720"/>
+        </w:tabs>
+        <w:autoSpaceDE w:val="0"/>
+        <w:autoSpaceDN w:val="0"/>
+        <w:adjustRightInd w:val="0"/>
+        <w:spacing w:after="0" w:line="240" w:lineRule="auto"/>
+        <w:rPr>
+          <w:rFonts w:ascii="Arial" w:hAnsi="Arial" w:cs="Arial"/>
+          <w:color w:val="000000"/>
           <w:sz w:val="17"/>
           <w:szCs w:val="24"/>
         </w:rPr>
-        <w:t>email}</w:t>
-      </w:r>
-    </w:p>
-    <w:p>
-      <w:pPr>
-        <w:framePr w:w="4111" w:h="216" w:hRule="exact" w:wrap="auto" w:vAnchor="page" w:hAnchor="page" w:x="6320" w:y="5247"/>
-        <w:widowControl w:val="0"/>
-        <w:tabs>
-          <w:tab w:val="left" w:pos="360"/>
-          <w:tab w:val="left" w:pos="720"/>
-        </w:tabs>
-        <w:autoSpaceDE w:val="0"/>
-        <w:autoSpaceDN w:val="0"/>
-        <w:adjustRightInd w:val="0"/>
-        <w:spacing w:after="0" w:line="240" w:lineRule="auto"/>
+      </w:pPr>
+      <w:r>
         <w:rPr>
           <w:rFonts w:ascii="Arial" w:hAnsi="Arial" w:cs="Arial"/>
           <w:color w:val="000000"/>
           <w:sz w:val="17"/>
           <w:szCs w:val="24"/>
         </w:rPr>
-      </w:pPr>
-    </w:p>
-    <w:p>
-      <w:pPr>
-        <w:framePr w:w="882" w:h="240" w:hRule="exact" w:wrap="auto" w:vAnchor="page" w:hAnchor="page" w:x="6320" w:y="4783"/>
+        <w:t>Phone :</w:t>
+      </w:r>
+    </w:p>
+    <w:p>
+      <w:pPr>
+        <w:framePr w:w="882" w:h="249" w:hRule="exact" w:wrap="auto" w:vAnchor="page" w:hAnchor="page" w:x="6320" w:y="2956"/>
         <w:widowControl w:val="0"/>
         <w:tabs>
           <w:tab w:val="left" w:pos="360"/>
@@ -1271,7 +1220,6 @@
           <w:szCs w:val="24"/>
         </w:rPr>
       </w:pPr>
-      <w:proofErr w:type="gramStart"/>
       <w:r>
         <w:rPr>
           <w:rFonts w:ascii="Arial" w:hAnsi="Arial" w:cs="Arial"/>
@@ -1279,49 +1227,8 @@
           <w:sz w:val="17"/>
           <w:szCs w:val="24"/>
         </w:rPr>
-        <w:t>Phone :</w:t>
-      </w:r>
-      <w:proofErr w:type="gramEnd"/>
-    </w:p>
-    <w:p>
-      <w:pPr>
-        <w:framePr w:w="882" w:h="249" w:hRule="exact" w:wrap="auto" w:vAnchor="page" w:hAnchor="page" w:x="6320" w:y="2956"/>
-        <w:widowControl w:val="0"/>
-        <w:tabs>
-          <w:tab w:val="left" w:pos="360"/>
-          <w:tab w:val="left" w:pos="720"/>
-        </w:tabs>
-        <w:autoSpaceDE w:val="0"/>
-        <w:autoSpaceDN w:val="0"/>
-        <w:adjustRightInd w:val="0"/>
-        <w:spacing w:after="0" w:line="240" w:lineRule="auto"/>
-        <w:rPr>
-          <w:rFonts w:ascii="Arial" w:hAnsi="Arial" w:cs="Arial"/>
-          <w:color w:val="000000"/>
-          <w:sz w:val="17"/>
-          <w:szCs w:val="24"/>
-        </w:rPr>
-      </w:pPr>
-      <w:r>
-        <w:rPr>
-          <w:rFonts w:ascii="Arial" w:hAnsi="Arial" w:cs="Arial"/>
-          <w:color w:val="000000"/>
-          <w:sz w:val="17"/>
-          <w:szCs w:val="24"/>
-        </w:rPr>
-        <w:t xml:space="preserve">Ship </w:t>
-      </w:r>
-      <w:proofErr w:type="gramStart"/>
-      <w:r>
-        <w:rPr>
-          <w:rFonts w:ascii="Arial" w:hAnsi="Arial" w:cs="Arial"/>
-          <w:color w:val="000000"/>
-          <w:sz w:val="17"/>
-          <w:szCs w:val="24"/>
-        </w:rPr>
-        <w:t>To :</w:t>
-      </w:r>
-      <w:proofErr w:type="gramEnd"/>
+        <w:t>Ship To :</w:t>
+      </w:r>
     </w:p>
     <w:p>
       <w:pPr>
@@ -1342,7 +1249,6 @@
           <w:szCs w:val="24"/>
         </w:rPr>
       </w:pPr>
-      <w:proofErr w:type="gramStart"/>
       <w:r>
         <w:rPr>
           <w:rFonts w:ascii="Arial" w:hAnsi="Arial" w:cs="Arial"/>
@@ -1352,7 +1258,6 @@
         </w:rPr>
         <w:t>No :</w:t>
       </w:r>
-      <w:proofErr w:type="gramEnd"/>
     </w:p>
     <w:p>
       <w:pPr>
@@ -1392,29 +1297,7 @@
           <w:sz w:val="19"/>
           <w:szCs w:val="19"/>
         </w:rPr>
-        <w:t>{</w:t>
-      </w:r>
-      <w:proofErr w:type="spellStart"/>
-      <w:r>
-        <w:rPr>
-          <w:rFonts w:ascii="Arial" w:eastAsia="Times New Roman" w:hAnsi="Arial" w:cs="Arial"/>
-          <w:color w:val="000000"/>
-          <w:kern w:val="2"/>
-          <w:sz w:val="19"/>
-          <w:szCs w:val="19"/>
-        </w:rPr>
-        <w:t>billTo</w:t>
-      </w:r>
-      <w:proofErr w:type="spellEnd"/>
-      <w:r>
-        <w:rPr>
-          <w:rFonts w:ascii="Arial" w:eastAsia="Times New Roman" w:hAnsi="Arial" w:cs="Arial"/>
-          <w:color w:val="000000"/>
-          <w:kern w:val="2"/>
-          <w:sz w:val="19"/>
-          <w:szCs w:val="19"/>
-        </w:rPr>
-        <w:t>}</w:t>
+        <w:t>{billTo}</w:t>
       </w:r>
     </w:p>
     <w:p>
@@ -2155,17 +2038,27 @@
           <w:sz w:val="18"/>
           <w:szCs w:val="18"/>
         </w:rPr>
-        <w:t>otal}/</w:t>
-      </w:r>
-      <w:r>
-        <w:rPr>
-          <w:rFonts w:ascii="Arial" w:hAnsi="Arial" w:cs="Arial"/>
-          <w:color w:val="000000"/>
-          <w:kern w:val="2"/>
-          <w:sz w:val="18"/>
-          <w:szCs w:val="18"/>
-        </w:rPr>
-        <w:t>{items}</w:t>
+        <w:t>otal}</w:t>
+      </w:r>
+      <w:r>
+        <w:rPr>
+          <w:rFonts w:ascii="Arial" w:hAnsi="Arial" w:cs="Arial"/>
+          <w:color w:val="000000"/>
+          <w:kern w:val="2"/>
+          <w:sz w:val="18"/>
+          <w:szCs w:val="18"/>
+        </w:rPr>
+        <w:t xml:space="preserve"> {/</w:t>
+      </w:r>
+      <w:r>
+        <w:rPr>
+          <w:rFonts w:ascii="Arial" w:hAnsi="Arial" w:cs="Arial"/>
+          <w:color w:val="000000"/>
+          <w:kern w:val="2"/>
+          <w:sz w:val="18"/>
+          <w:szCs w:val="18"/>
+        </w:rPr>
+        <w:t>items}</w:t>
       </w:r>
     </w:p>
     <w:p>
@@ -3962,49 +3855,57 @@
           <w:sz w:val="17"/>
           <w:szCs w:val="17"/>
         </w:rPr>
-        <w:t xml:space="preserve">Terms and </w:t>
-      </w:r>
-      <w:proofErr w:type="gramStart"/>
-      <w:r>
+        <w:t>Terms and Conditions :</w:t>
+      </w:r>
+    </w:p>
+    <w:p>
+      <w:pPr>
+        <w:framePr w:w="936" w:h="255" w:hRule="exact" w:wrap="auto" w:vAnchor="page" w:hAnchor="page" w:x="649" w:y="12626"/>
+        <w:widowControl w:val="0"/>
+        <w:tabs>
+          <w:tab w:val="left" w:pos="360"/>
+          <w:tab w:val="left" w:pos="720"/>
+        </w:tabs>
+        <w:autoSpaceDE w:val="0"/>
+        <w:autoSpaceDN w:val="0"/>
+        <w:adjustRightInd w:val="0"/>
+        <w:spacing w:after="0" w:line="240" w:lineRule="auto"/>
         <w:rPr>
           <w:rFonts w:ascii="Arial" w:hAnsi="Arial" w:cs="Arial"/>
           <w:color w:val="000000"/>
           <w:sz w:val="17"/>
           <w:szCs w:val="17"/>
         </w:rPr>
-        <w:t>Conditions :</w:t>
-      </w:r>
-      <w:proofErr w:type="gramEnd"/>
-    </w:p>
-    <w:p>
-      <w:pPr>
-        <w:framePr w:w="936" w:h="255" w:hRule="exact" w:wrap="auto" w:vAnchor="page" w:hAnchor="page" w:x="649" w:y="12626"/>
-        <w:widowControl w:val="0"/>
-        <w:tabs>
-          <w:tab w:val="left" w:pos="360"/>
-          <w:tab w:val="left" w:pos="720"/>
-        </w:tabs>
-        <w:autoSpaceDE w:val="0"/>
-        <w:autoSpaceDN w:val="0"/>
-        <w:adjustRightInd w:val="0"/>
-        <w:spacing w:after="0" w:line="240" w:lineRule="auto"/>
+      </w:pPr>
+      <w:r>
         <w:rPr>
           <w:rFonts w:ascii="Arial" w:hAnsi="Arial" w:cs="Arial"/>
           <w:color w:val="000000"/>
           <w:sz w:val="17"/>
           <w:szCs w:val="17"/>
         </w:rPr>
-      </w:pPr>
-      <w:r>
+        <w:t>Valid until :</w:t>
+      </w:r>
+    </w:p>
+    <w:p>
+      <w:pPr>
+        <w:framePr w:w="936" w:h="255" w:hRule="exact" w:wrap="auto" w:vAnchor="page" w:hAnchor="page" w:x="649" w:y="12842"/>
+        <w:widowControl w:val="0"/>
+        <w:tabs>
+          <w:tab w:val="left" w:pos="360"/>
+          <w:tab w:val="left" w:pos="720"/>
+        </w:tabs>
+        <w:autoSpaceDE w:val="0"/>
+        <w:autoSpaceDN w:val="0"/>
+        <w:adjustRightInd w:val="0"/>
+        <w:spacing w:after="0" w:line="240" w:lineRule="auto"/>
         <w:rPr>
           <w:rFonts w:ascii="Arial" w:hAnsi="Arial" w:cs="Arial"/>
           <w:color w:val="000000"/>
           <w:sz w:val="17"/>
           <w:szCs w:val="17"/>
         </w:rPr>
-        <w:t xml:space="preserve">Valid </w:t>
-      </w:r>
-      <w:proofErr w:type="gramStart"/>
+      </w:pPr>
       <w:r>
         <w:rPr>
           <w:rFonts w:ascii="Arial" w:hAnsi="Arial" w:cs="Arial"/>
@@ -4012,13 +3913,12 @@
           <w:sz w:val="17"/>
           <w:szCs w:val="17"/>
         </w:rPr>
-        <w:t>until :</w:t>
-      </w:r>
-      <w:proofErr w:type="gramEnd"/>
-    </w:p>
-    <w:p>
-      <w:pPr>
-        <w:framePr w:w="936" w:h="255" w:hRule="exact" w:wrap="auto" w:vAnchor="page" w:hAnchor="page" w:x="649" w:y="12842"/>
+        <w:t>Payment :</w:t>
+      </w:r>
+    </w:p>
+    <w:p>
+      <w:pPr>
+        <w:framePr w:w="936" w:h="255" w:hRule="exact" w:wrap="auto" w:vAnchor="page" w:hAnchor="page" w:x="646" w:y="13058"/>
         <w:widowControl w:val="0"/>
         <w:tabs>
           <w:tab w:val="left" w:pos="360"/>
@@ -4035,7 +3935,6 @@
           <w:szCs w:val="17"/>
         </w:rPr>
       </w:pPr>
-      <w:proofErr w:type="gramStart"/>
       <w:r>
         <w:rPr>
           <w:rFonts w:ascii="Arial" w:hAnsi="Arial" w:cs="Arial"/>
@@ -4043,40 +3942,8 @@
           <w:sz w:val="17"/>
           <w:szCs w:val="17"/>
         </w:rPr>
-        <w:t>Payment :</w:t>
-      </w:r>
-      <w:proofErr w:type="gramEnd"/>
-    </w:p>
-    <w:p>
-      <w:pPr>
-        <w:framePr w:w="936" w:h="255" w:hRule="exact" w:wrap="auto" w:vAnchor="page" w:hAnchor="page" w:x="646" w:y="13058"/>
-        <w:widowControl w:val="0"/>
-        <w:tabs>
-          <w:tab w:val="left" w:pos="360"/>
-          <w:tab w:val="left" w:pos="720"/>
-        </w:tabs>
-        <w:autoSpaceDE w:val="0"/>
-        <w:autoSpaceDN w:val="0"/>
-        <w:adjustRightInd w:val="0"/>
-        <w:spacing w:after="0" w:line="240" w:lineRule="auto"/>
-        <w:rPr>
-          <w:rFonts w:ascii="Arial" w:hAnsi="Arial" w:cs="Arial"/>
-          <w:color w:val="000000"/>
-          <w:sz w:val="17"/>
-          <w:szCs w:val="17"/>
-        </w:rPr>
-      </w:pPr>
-      <w:proofErr w:type="gramStart"/>
-      <w:r>
-        <w:rPr>
-          <w:rFonts w:ascii="Arial" w:hAnsi="Arial" w:cs="Arial"/>
-          <w:color w:val="000000"/>
-          <w:sz w:val="17"/>
-          <w:szCs w:val="17"/>
-        </w:rPr>
         <w:t>Delivery :</w:t>
       </w:r>
-      <w:proofErr w:type="gramEnd"/>
     </w:p>
     <w:p>
       <w:pPr>

</xml_diff>